<commit_message>
Record successful release build and emulator launch with verification logs
</commit_message>
<xml_diff>
--- a/docs/Het_Jani_Activity11_Ghost_Hunt.docx
+++ b/docs/Het_Jani_Activity11_Ghost_Hunt.docx
@@ -391,6 +391,11 @@
         <w:t>Reflection guidance to personalize: Describe a change you personally reviewed, explain why pushReplacement matters, and identify a test you personally ran. Do not turn these prompts into claims of experiences you have not had.</w:t>
       </w:r>
     </w:p>
+    <w:p>
+      <w:r>
+        <w:t>Final APK check: the integrated release APK built successfully, installed on the Pixel_4a emulator, and displayed the completed welcome screen. The direct capture is evidence/screenshots/emulator-integrated-welcome.png. The full navigation result above remains widget-test evidence. A disk-space build failure was resolved by clearing session-generated build output; both logs are retained.</w:t>
+      </w:r>
+    </w:p>
     <w:sectPr>
       <w:pgSz w:w="12240" w:h="15840"/>
       <w:pgMar w:top="1440" w:right="1800" w:bottom="1440" w:left="1800" w:header="720" w:footer="720" w:gutter="0"/>

</xml_diff>